<commit_message>
Paso W-1: Normalizar binarios de Semana 2 (FGAP010 Word/PDF y Cuadro de Principios PPTX/PDF)
</commit_message>
<xml_diff>
--- a/curso/semana-02-scrum-y-acta/nuestras-entregas/FGAP010_Acta_Constitucion_NewBit/FGAP010_Acta_Constitucion_NewBit.docx
+++ b/curso/semana-02-scrum-y-acta/nuestras-entregas/FGAP010_Acta_Constitucion_NewBit/FGAP010_Acta_Constitucion_NewBit.docx
@@ -325,19 +325,8 @@
             </w:tcBorders>
           </w:tcPr>
           <w:p>
-            <w:pPr>
-              <w:spacing w:after="60" w:before="60" w:lineRule="auto"/>
-              <w:rPr/>
-            </w:pPr>
             <w:r>
-              <w:rPr>
-                <w:b w:val="0"/>
-                <w:bCs w:val="0"/>
-                <w:sz w:val="20"/>
-                <w:szCs w:val="20"/>
-                <w:rtl w:val="0"/>
-              </w:rPr>
-              <w:t>1.0</w:t>
+              <w:t>2.0</w:t>
             </w:r>
           </w:p>
         </w:tc>
@@ -461,19 +450,8 @@
             </w:tcBorders>
           </w:tcPr>
           <w:p>
-            <w:pPr>
-              <w:spacing w:after="60" w:before="60" w:lineRule="auto"/>
-              <w:rPr/>
-            </w:pPr>
             <w:r>
-              <w:rPr>
-                <w:b w:val="0"/>
-                <w:bCs w:val="0"/>
-                <w:sz w:val="20"/>
-                <w:szCs w:val="20"/>
-                <w:rtl w:val="0"/>
-              </w:rPr>
-              <w:t>12/10/2026</w:t>
+              <w:t>17/10/2026</w:t>
             </w:r>
           </w:p>
         </w:tc>
@@ -487,19 +465,8 @@
             </w:tcBorders>
           </w:tcPr>
           <w:p>
-            <w:pPr>
-              <w:spacing w:after="60" w:before="60" w:lineRule="auto"/>
-              <w:rPr/>
-            </w:pPr>
             <w:r>
-              <w:rPr>
-                <w:b w:val="0"/>
-                <w:bCs w:val="0"/>
-                <w:sz w:val="20"/>
-                <w:szCs w:val="20"/>
-                <w:rtl w:val="0"/>
-              </w:rPr>
-              <w:t>Emisión inicial de NewBit</w:t>
+              <w:t>Normalización a manufactura metalmecánica, YOLOv8 y sincronización de presupuesto</w:t>
             </w:r>
           </w:p>
         </w:tc>
@@ -600,15 +567,8 @@
             </w:tcBorders>
           </w:tcPr>
           <w:p>
-            <w:pPr>
-              <w:spacing w:after="80" w:lineRule="auto"/>
-              <w:rPr/>
-            </w:pPr>
             <w:r>
-              <w:rPr>
-                <w:rtl w:val="0"/>
-              </w:rPr>
-              <w:t>PY-NB-001 – NewBit: plataforma de Computer Vision que convierte cámaras existentes en sensores inteligentes configurables para operaciones industriales</w:t>
+              <w:t>PY-NB-001 – Sistema web con Visión Artificial para la detección de actos inseguros en áreas operativas de manufactura metalmecánica (Nombre comercial: NewBit)</w:t>
             </w:r>
           </w:p>
         </w:tc>
@@ -695,39 +655,8 @@
             </w:tcBorders>
           </w:tcPr>
           <w:p>
-            <w:pPr>
-              <w:spacing w:after="80" w:lineRule="auto"/>
-              <w:rPr/>
-            </w:pPr>
             <w:r>
-              <w:rPr>
-                <w:rtl w:val="0"/>
-              </w:rPr>
-              <w:t>NewBit es una plataforma de Computer Vision que convierte las cámaras que una planta ya tiene en sensores inteligentes configurables. En lugar de grabar video que nadie revisa a tiempo, NewBit entiende lo que ocurre frente a la cámara y lo convierte en eventos operativos claros, oportunos y accionables.</w:t>
-            </w:r>
-          </w:p>
-          <w:p>
-            <w:pPr>
-              <w:spacing w:after="80" w:lineRule="auto"/>
-              <w:rPr/>
-            </w:pPr>
-            <w:r>
-              <w:rPr>
-                <w:rtl w:val="0"/>
-              </w:rPr>
-              <w:t>Su primera capacidad es la detección automática de conductas inseguras. La mayoría de los accidentes laborales nace de una acción, no de un objeto: alguien que sale de la vía peatonal o un panel eléctrico que queda abierto. Por eso NewBit no analiza fotos aisladas: combina detección de objetos (YOLOv4) con un modelo espacio-temporal (ConvLSTM) que observa la secuencia completa, reconoce la conducta y emite una alerta visual y sonora en segundos.</w:t>
-            </w:r>
-          </w:p>
-          <w:p>
-            <w:pPr>
-              <w:spacing w:after="80" w:lineRule="auto"/>
-              <w:rPr/>
-            </w:pPr>
-            <w:r>
-              <w:rPr>
-                <w:rtl w:val="0"/>
-              </w:rPr>
-              <w:t>Así, el supervisor de Seguridad y Salud en el Trabajo (SST) deja de depender de inspecciones esporádicas y pasa a contar con una vigilancia continua que le avisa en el momento en que puede intervenir. NewBit apoya la decisión humana, no la reemplaza, y respeta la privacidad: no identifica personas ni usa reconocimiento facial.</w:t>
+              <w:t>NewBit es un sistema web con Visión Artificial diseñado para la detección y registro de actos inseguros en áreas operativas de manufactura metalmecánica. En lugar de depender exclusivamente de inspecciones humanas esporádicas o almacenar horas de video sin revisar, NewBit procesa clips de video grabados (.mp4) por lotes, detecta personas y zonas operativas mediante visión por computadora espacial (YOLOv8) y clasifica secuencias temporales para alertar sobre conductas de riesgo (vías peatonales invadidas y tableros eléctricos abiertos). El sistema genera registros verificables y alertas visuales/sonoras oportunas para que el área de Seguridad y Salud en el Trabajo (SST) actúe con rapidez, respetando la privacidad de los operarios sin realizar reconocimiento facial ni biometría.</w:t>
             </w:r>
           </w:p>
         </w:tc>
@@ -814,174 +743,33 @@
             </w:tcBorders>
           </w:tcPr>
           <w:p>
-            <w:pPr>
-              <w:spacing w:after="80" w:lineRule="auto"/>
-              <w:rPr/>
-            </w:pPr>
             <w:r>
-              <w:rPr>
-                <w:b/>
-                <w:bCs/>
-                <w:rtl w:val="0"/>
-              </w:rPr>
               <w:t>Requisitos funcionales</w:t>
-            </w:r>
-          </w:p>
-          <w:p>
-            <w:pPr>
-              <w:spacing w:after="80" w:lineRule="auto"/>
-              <w:rPr/>
-            </w:pPr>
-            <w:r>
-              <w:rPr>
-                <w:rtl w:val="0"/>
-              </w:rPr>
+              <w:br/>
               <w:t>- RF-01: cargar clips de video en formato MP4.</w:t>
-            </w:r>
-          </w:p>
-          <w:p>
-            <w:pPr>
-              <w:spacing w:after="80" w:lineRule="auto"/>
-              <w:rPr/>
-            </w:pPr>
-            <w:r>
-              <w:rPr>
-                <w:rtl w:val="0"/>
-              </w:rPr>
-              <w:t>- RF-02: detectar personas y objetos de interés frame a frame con YOLOv4.</w:t>
-            </w:r>
-          </w:p>
-          <w:p>
-            <w:pPr>
-              <w:spacing w:after="80" w:lineRule="auto"/>
-              <w:rPr/>
-            </w:pPr>
-            <w:r>
-              <w:rPr>
-                <w:rtl w:val="0"/>
-              </w:rPr>
+              <w:br/>
+              <w:t>- RF-02: detectar personas y objetos de interés frame a frame con YOLOv8.</w:t>
+              <w:br/>
               <w:t>- RF-03: conservar solo los frames relevantes según una regla explícita y configurable.</w:t>
-            </w:r>
-          </w:p>
-          <w:p>
-            <w:pPr>
-              <w:spacing w:after="80" w:lineRule="auto"/>
-              <w:rPr/>
-            </w:pPr>
-            <w:r>
-              <w:rPr>
-                <w:rtl w:val="0"/>
-              </w:rPr>
+              <w:br/>
               <w:t>- RF-04: agrupar los frames conservados en secuencias.</w:t>
-            </w:r>
-          </w:p>
-          <w:p>
-            <w:pPr>
-              <w:spacing w:after="80" w:lineRule="auto"/>
-              <w:rPr/>
-            </w:pPr>
-            <w:r>
-              <w:rPr>
-                <w:rtl w:val="0"/>
-              </w:rPr>
+              <w:br/>
               <w:t>- RF-05: clasificar cada secuencia con ConvLSTM como conducta segura o insegura.</w:t>
-            </w:r>
-          </w:p>
-          <w:p>
-            <w:pPr>
-              <w:spacing w:after="80" w:lineRule="auto"/>
-              <w:rPr/>
-            </w:pPr>
-            <w:r>
-              <w:rPr>
-                <w:rtl w:val="0"/>
-              </w:rPr>
+              <w:br/>
               <w:t>- RF-06: registrar por clip el archivo, la clase, la confianza, el tiempo de proceso, los frames originales y los conservados.</w:t>
-            </w:r>
-          </w:p>
-          <w:p>
-            <w:pPr>
-              <w:spacing w:after="80" w:lineRule="auto"/>
-              <w:rPr/>
-            </w:pPr>
-            <w:r>
-              <w:rPr>
-                <w:rtl w:val="0"/>
-              </w:rPr>
+              <w:br/>
               <w:t>- RF-07: mostrar una alerta visual y sonora cuando se detecte una conducta insegura.</w:t>
-            </w:r>
-          </w:p>
-          <w:p>
-            <w:pPr>
-              <w:spacing w:after="80" w:lineRule="auto"/>
-              <w:rPr/>
-            </w:pPr>
-            <w:r>
-              <w:rPr>
-                <w:b/>
-                <w:bCs/>
-                <w:rtl w:val="0"/>
-              </w:rPr>
+              <w:br/>
               <w:t>Requisitos no funcionales</w:t>
-            </w:r>
-          </w:p>
-          <w:p>
-            <w:pPr>
-              <w:spacing w:after="80" w:lineRule="auto"/>
-              <w:rPr/>
-            </w:pPr>
-            <w:r>
-              <w:rPr>
-                <w:rtl w:val="0"/>
-              </w:rPr>
+              <w:br/>
               <w:t>- Reproducibilidad: configuración versionada, semillas fijas cuando sea posible y checkpoints del modelo.</w:t>
-            </w:r>
-          </w:p>
-          <w:p>
-            <w:pPr>
-              <w:spacing w:after="80" w:lineRule="auto"/>
-              <w:rPr/>
-            </w:pPr>
-            <w:r>
-              <w:rPr>
-                <w:rtl w:val="0"/>
-              </w:rPr>
+              <w:br/>
               <w:t>- Separación estricta entre entrenamiento y prueba con el split oficial del dataset; el conjunto de prueba no se modifica.</w:t>
-            </w:r>
-          </w:p>
-          <w:p>
-            <w:pPr>
-              <w:spacing w:after="80" w:lineRule="auto"/>
-              <w:rPr/>
-            </w:pPr>
-            <w:r>
-              <w:rPr>
-                <w:rtl w:val="0"/>
-              </w:rPr>
+              <w:br/>
               <w:t>- Métricas por clase y registro de tiempos de procesamiento.</w:t>
-            </w:r>
-          </w:p>
-          <w:p>
-            <w:pPr>
-              <w:spacing w:after="80" w:lineRule="auto"/>
-              <w:rPr/>
-            </w:pPr>
-            <w:r>
-              <w:rPr>
-                <w:rtl w:val="0"/>
-              </w:rPr>
+              <w:br/>
               <w:t>- Uso del dataset con atribución, según su licencia CC BY 4.0.</w:t>
-            </w:r>
-          </w:p>
-          <w:p>
-            <w:pPr>
-              <w:spacing w:after="80" w:lineRule="auto"/>
-              <w:rPr/>
-            </w:pPr>
-            <w:r>
-              <w:rPr>
-                <w:rtl w:val="0"/>
-              </w:rPr>
+              <w:br/>
               <w:t>- Privacidad por diseño: sin reconocimiento facial ni identificación de personas.</w:t>
             </w:r>
           </w:p>
@@ -1082,189 +870,36 @@
             </w:tcBorders>
           </w:tcPr>
           <w:p>
-            <w:pPr>
-              <w:spacing w:after="80" w:lineRule="auto"/>
-              <w:rPr/>
-            </w:pPr>
             <w:r>
-              <w:rPr>
-                <w:rtl w:val="0"/>
-              </w:rPr>
               <w:t>El proyecto comprende el diseño, la construcción y la evaluación de la primera versión de NewBit: un pipeline completo que recibe video industrial, filtra los frames relevantes, reconoce la conducta y la comunica en una interfaz con registro y alerta.</w:t>
-            </w:r>
-          </w:p>
-          <w:p>
-            <w:pPr>
-              <w:spacing w:after="80" w:lineRule="auto"/>
-              <w:rPr/>
-            </w:pPr>
-            <w:r>
-              <w:rPr>
-                <w:b/>
-                <w:bCs/>
-                <w:rtl w:val="0"/>
-              </w:rPr>
+              <w:br/>
               <w:t>Alcance</w:t>
-            </w:r>
-          </w:p>
-          <w:p>
-            <w:pPr>
-              <w:spacing w:after="80" w:lineRule="auto"/>
-              <w:rPr/>
-            </w:pPr>
-            <w:r>
-              <w:rPr>
-                <w:rtl w:val="0"/>
-              </w:rPr>
+              <w:br/>
               <w:t>- Conductas de la primera versión: tránsito fuera de la vía peatonal (Safe Walkway Violation) y panel eléctrico abierto (Opened Panel Cover), con sus casos seguros de contraste. La arquitectura queda preparada para incorporar nuevas conductas.</w:t>
-            </w:r>
-          </w:p>
-          <w:p>
-            <w:pPr>
-              <w:spacing w:after="80" w:lineRule="auto"/>
-              <w:rPr/>
-            </w:pPr>
-            <w:r>
-              <w:rPr>
-                <w:rtl w:val="0"/>
-              </w:rPr>
+              <w:br/>
               <w:t>- Datos: Video Dataset for Safe and Unsafe Behaviours (Önal y Dandıl, 2024; Mendeley Data, DOI 10.17632/xjmtb22pff.1, licencia CC BY 4.0), grabado en una planta industrial real, con su división oficial de entrenamiento y prueba.</w:t>
-            </w:r>
-          </w:p>
-          <w:p>
-            <w:pPr>
-              <w:spacing w:after="80" w:lineRule="auto"/>
-              <w:rPr/>
-            </w:pPr>
-            <w:r>
-              <w:rPr>
-                <w:rtl w:val="0"/>
-              </w:rPr>
-              <w:t>- Evaluación: comparación entre la clasificación temporal directa y el pipeline completo de NewBit (YOLOv4 + ConvLSTM), en precisión y tiempo de procesamiento.</w:t>
-            </w:r>
-          </w:p>
-          <w:p>
-            <w:pPr>
-              <w:spacing w:after="80" w:lineRule="auto"/>
-              <w:rPr/>
-            </w:pPr>
-            <w:r>
-              <w:rPr>
-                <w:b/>
-                <w:bCs/>
-                <w:rtl w:val="0"/>
-              </w:rPr>
+              <w:br/>
+              <w:t>- Evaluación: comparación entre la clasificación temporal directa y el pipeline completo de NewBit (YOLOv8 + ConvLSTM), en precisión y tiempo de procesamiento.</w:t>
+              <w:br/>
               <w:t>Límites (fuera del alcance de esta versión)</w:t>
-            </w:r>
-          </w:p>
-          <w:p>
-            <w:pPr>
-              <w:spacing w:after="80" w:lineRule="auto"/>
-              <w:rPr/>
-            </w:pPr>
-            <w:r>
-              <w:rPr>
-                <w:rtl w:val="0"/>
-              </w:rPr>
+              <w:br/>
               <w:t>- Instalación en la planta, conexión a cámaras en vivo y dispositivos de alerta físicos.</w:t>
-            </w:r>
-          </w:p>
-          <w:p>
-            <w:pPr>
-              <w:spacing w:after="80" w:lineRule="auto"/>
-              <w:rPr/>
-            </w:pPr>
-            <w:r>
-              <w:rPr>
-                <w:rtl w:val="0"/>
-              </w:rPr>
+              <w:br/>
               <w:t>- Reconocimiento facial o identificación de trabajadores.</w:t>
-            </w:r>
-          </w:p>
-          <w:p>
-            <w:pPr>
-              <w:spacing w:after="80" w:lineRule="auto"/>
-              <w:rPr/>
-            </w:pPr>
-            <w:r>
-              <w:rPr>
-                <w:rtl w:val="0"/>
-              </w:rPr>
+              <w:br/>
               <w:t>- Certificación oficial de SST; no se afirmará reducción de accidentes sin evidencia.</w:t>
-            </w:r>
-          </w:p>
-          <w:p>
-            <w:pPr>
-              <w:spacing w:after="80" w:lineRule="auto"/>
-              <w:rPr/>
-            </w:pPr>
-            <w:r>
-              <w:rPr>
-                <w:b/>
-                <w:bCs/>
-                <w:rtl w:val="0"/>
-              </w:rPr>
+              <w:br/>
               <w:t>Entregables clave</w:t>
-            </w:r>
-          </w:p>
-          <w:p>
-            <w:pPr>
-              <w:spacing w:after="80" w:lineRule="auto"/>
-              <w:rPr/>
-            </w:pPr>
-            <w:r>
-              <w:rPr>
-                <w:rtl w:val="0"/>
-              </w:rPr>
+              <w:br/>
               <w:t>- Documentos de gestión: Acta, Registro de Stakeholders, Roles y Prototipos, Épicas, Backlog priorizado, Criterios de Terminado y Cierre.</w:t>
-            </w:r>
-          </w:p>
-          <w:p>
-            <w:pPr>
-              <w:spacing w:after="80" w:lineRule="auto"/>
-              <w:rPr/>
-            </w:pPr>
-            <w:r>
-              <w:rPr>
-                <w:rtl w:val="0"/>
-              </w:rPr>
-              <w:t>- Conjunto de frames anotados y modelo YOLOv4 entrenado.</w:t>
-            </w:r>
-          </w:p>
-          <w:p>
-            <w:pPr>
-              <w:spacing w:after="80" w:lineRule="auto"/>
-              <w:rPr/>
-            </w:pPr>
-            <w:r>
-              <w:rPr>
-                <w:rtl w:val="0"/>
-              </w:rPr>
+              <w:br/>
+              <w:t>- Conjunto de frames anotados y modelo YOLOv8 entrenado.</w:t>
+              <w:br/>
               <w:t>- Modelo ConvLSTM entrenado y evaluado, con métricas por clase.</w:t>
-            </w:r>
-          </w:p>
-          <w:p>
-            <w:pPr>
-              <w:spacing w:after="80" w:lineRule="auto"/>
-              <w:rPr/>
-            </w:pPr>
-            <w:r>
-              <w:rPr>
-                <w:rtl w:val="0"/>
-              </w:rPr>
+              <w:br/>
               <w:t>- Plataforma NewBit con interfaz, registro de detecciones y alerta.</w:t>
-            </w:r>
-          </w:p>
-          <w:p>
-            <w:pPr>
-              <w:spacing w:after="80" w:lineRule="auto"/>
-              <w:rPr/>
-            </w:pPr>
-            <w:r>
-              <w:rPr>
-                <w:rtl w:val="0"/>
-              </w:rPr>
-              <w:t>- Informe técnico con resultados, métricas y decisiones de diseño.</w:t>
+              <w:br/>
+              <w:t>- Informe técnico con resultados, métricas y decisiones de diseño. Límites explícitos: El sistema procesa archivos de video en lote (.mp4); no incluye streaming RTSP en vivo de cámaras de seguridad físicas ni instalación de hardware de sensores en planta.</w:t>
             </w:r>
           </w:p>
         </w:tc>
@@ -1806,19 +1441,8 @@
             </w:tcBorders>
           </w:tcPr>
           <w:p>
-            <w:pPr>
-              <w:spacing w:after="60" w:before="60" w:lineRule="auto"/>
-              <w:rPr/>
-            </w:pPr>
             <w:r>
-              <w:rPr>
-                <w:b w:val="0"/>
-                <w:bCs w:val="0"/>
-                <w:sz w:val="20"/>
-                <w:szCs w:val="20"/>
-                <w:rtl w:val="0"/>
-              </w:rPr>
-              <w:t>Sprint 2: entrenamiento de YOLOv4, filtrado de frames y segmentación de clips</w:t>
+              <w:t>Sprint 2: inferencia espacial con YOLOv8, reducción de fotogramas, configuración de umbrales (HU11) y segmentación de clips</w:t>
             </w:r>
           </w:p>
         </w:tc>
@@ -1890,19 +1514,8 @@
             </w:tcBorders>
           </w:tcPr>
           <w:p>
-            <w:pPr>
-              <w:spacing w:after="60" w:before="60" w:lineRule="auto"/>
-              <w:rPr/>
-            </w:pPr>
             <w:r>
-              <w:rPr>
-                <w:b w:val="0"/>
-                <w:bCs w:val="0"/>
-                <w:sz w:val="20"/>
-                <w:szCs w:val="20"/>
-                <w:rtl w:val="0"/>
-              </w:rPr>
-              <w:t>Sprint 3: modelo ConvLSTM, pipeline completo YOLOv4 + ConvLSTM y evaluación comparativa</w:t>
+              <w:t>Sprint 3: modelo ConvLSTM, pipeline completo YOLOv8 + ConvLSTM y evaluación comparativa</w:t>
             </w:r>
           </w:p>
         </w:tc>
@@ -2486,19 +2099,8 @@
             </w:tcBorders>
           </w:tcPr>
           <w:p>
-            <w:pPr>
-              <w:spacing w:after="60" w:before="60" w:lineRule="auto"/>
-              <w:rPr/>
-            </w:pPr>
             <w:r>
-              <w:rPr>
-                <w:b w:val="0"/>
-                <w:bCs w:val="0"/>
-                <w:sz w:val="20"/>
-                <w:szCs w:val="20"/>
-                <w:rtl w:val="0"/>
-              </w:rPr>
-              <w:t>Luis Salazar (Developer): datos, YOLOv4 y ConvLSTM</w:t>
+              <w:t>Luis Salazar (Developer): pipeline, visión con OpenCV y YOLOv8</w:t>
             </w:r>
           </w:p>
         </w:tc>
@@ -2906,19 +2508,8 @@
             </w:tcBorders>
           </w:tcPr>
           <w:p>
-            <w:pPr>
-              <w:spacing w:after="60" w:before="60" w:lineRule="auto"/>
-              <w:rPr/>
-            </w:pPr>
             <w:r>
-              <w:rPr>
-                <w:b w:val="0"/>
-                <w:bCs w:val="0"/>
-                <w:sz w:val="20"/>
-                <w:szCs w:val="20"/>
-                <w:rtl w:val="0"/>
-              </w:rPr>
-              <w:t>Portátiles y software abierto (Python, PyTorch, Darknet, LabelImg)</w:t>
+              <w:t>Portátiles y software abierto (Python, FastAPI, OpenCV, Ultralytics YOLOv8)</w:t>
             </w:r>
           </w:p>
         </w:tc>
@@ -3532,19 +3123,8 @@
             </w:tcBorders>
           </w:tcPr>
           <w:p>
-            <w:pPr>
-              <w:spacing w:after="60" w:before="60" w:lineRule="auto"/>
-              <w:rPr/>
-            </w:pPr>
             <w:r>
-              <w:rPr>
-                <w:b w:val="0"/>
-                <w:bCs w:val="0"/>
-                <w:sz w:val="20"/>
-                <w:szCs w:val="20"/>
-                <w:rtl w:val="0"/>
-              </w:rPr>
-              <w:t>Developer. Prepara los datos y entrena y evalúa los modelos YOLOv4 y ConvLSTM.</w:t>
+              <w:t>Developer. Prepara los datos, implementa la ingesta de video y evalúa los modelos YOLOv8 y ConvLSTM.</w:t>
             </w:r>
           </w:p>
         </w:tc>
@@ -3590,19 +3170,8 @@
             </w:tcBorders>
           </w:tcPr>
           <w:p>
-            <w:pPr>
-              <w:spacing w:after="60" w:before="60" w:lineRule="auto"/>
-              <w:rPr/>
-            </w:pPr>
             <w:r>
-              <w:rPr>
-                <w:b w:val="0"/>
-                <w:bCs w:val="0"/>
-                <w:sz w:val="20"/>
-                <w:szCs w:val="20"/>
-                <w:rtl w:val="0"/>
-              </w:rPr>
-              <w:t>Sponsor; gerente de operaciones de SIDERPERU. Autoriza el proyecto y resuelve recursos.</w:t>
+              <w:t>Sponsor; Gerente General de la empresa de manufactura metalmecánica. Autoriza el proyecto y aprueba los recursos.</w:t>
             </w:r>
           </w:p>
         </w:tc>
@@ -3845,12 +3414,7 @@
         <w:rPr/>
       </w:pPr>
       <w:r>
-        <w:rPr>
-          <w:b w:val="0"/>
-          <w:bCs w:val="0"/>
-          <w:rtl w:val="0"/>
-        </w:rPr>
-        <w:t>El equipo Scrum está formado por tres estudiantes del curso. Organización del caso: SIDERPERU (caso académico propuesto). Los representantes institucionales (Sponsor, SST, TI) y sus cargos son ficticios; no expresan un vínculo real con la empresa ni se usará video de sus instalaciones.</w:t>
+        <w:t>El equipo Scrum está formado por tres estudiantes del curso. Organización del caso: Taller de manufactura metalmecánica / mecanizado industrial (caso propuesto equivalente al entorno del dataset de Kafaoğlu). Los representantes institucionales (Sponsor, SST, TI) y sus cargos son ficticios para fines de modelado académico; no expresan un vínculo legal ni se usará video privado de sus instalaciones.</w:t>
       </w:r>
     </w:p>
     <w:tbl>
@@ -3923,98 +3487,21 @@
             </w:tcBorders>
           </w:tcPr>
           <w:p>
-            <w:pPr>
-              <w:spacing w:after="80" w:lineRule="auto"/>
-              <w:rPr/>
-            </w:pPr>
             <w:r>
-              <w:rPr>
-                <w:rtl w:val="0"/>
-              </w:rPr>
               <w:t>El éxito se acreditará con una demostración de NewBit y el informe técnico, revisados por el Product Owner y el docente. Criterios:</w:t>
-            </w:r>
-          </w:p>
-          <w:p>
-            <w:pPr>
-              <w:spacing w:after="80" w:lineRule="auto"/>
-              <w:rPr/>
-            </w:pPr>
-            <w:r>
-              <w:rPr>
-                <w:rtl w:val="0"/>
-              </w:rPr>
-              <w:t>- Funciona el pipeline completo: video → YOLOv4 → selección de frames → ConvLSTM → registro y alerta.</w:t>
-            </w:r>
-          </w:p>
-          <w:p>
-            <w:pPr>
-              <w:spacing w:after="80" w:lineRule="auto"/>
-              <w:rPr/>
-            </w:pPr>
-            <w:r>
-              <w:rPr>
-                <w:rtl w:val="0"/>
-              </w:rPr>
+              <w:br/>
+              <w:t>- Funciona el pipeline completo: video → YOLOv8 → selección de frames → ConvLSTM → registro y alerta.</w:t>
+              <w:br/>
               <w:t>- Las etapas espacial (detección) y temporal (clasificación) están separadas y se pueden evaluar por separado.</w:t>
-            </w:r>
-          </w:p>
-          <w:p>
-            <w:pPr>
-              <w:spacing w:after="80" w:lineRule="auto"/>
-              <w:rPr/>
-            </w:pPr>
-            <w:r>
-              <w:rPr>
-                <w:rtl w:val="0"/>
-              </w:rPr>
+              <w:br/>
               <w:t>- Se demuestra con datos la reducción de frames por secuencia y su efecto en el tiempo de procesamiento.</w:t>
-            </w:r>
-          </w:p>
-          <w:p>
-            <w:pPr>
-              <w:spacing w:after="80" w:lineRule="auto"/>
-              <w:rPr/>
-            </w:pPr>
-            <w:r>
-              <w:rPr>
-                <w:rtl w:val="0"/>
-              </w:rPr>
+              <w:br/>
               <w:t>- La evaluación compara la clasificación temporal directa con el pipeline completo mediante métricas por clase y tiempos.</w:t>
-            </w:r>
-          </w:p>
-          <w:p>
-            <w:pPr>
-              <w:spacing w:after="80" w:lineRule="auto"/>
-              <w:rPr/>
-            </w:pPr>
-            <w:r>
-              <w:rPr>
-                <w:rtl w:val="0"/>
-              </w:rPr>
+              <w:br/>
               <w:t>- Las decisiones técnicas y sus resultados quedan documentados.</w:t>
-            </w:r>
-          </w:p>
-          <w:p>
-            <w:pPr>
-              <w:spacing w:after="80" w:lineRule="auto"/>
-              <w:rPr/>
-            </w:pPr>
-            <w:r>
-              <w:rPr>
-                <w:rtl w:val="0"/>
-              </w:rPr>
+              <w:br/>
               <w:t>- Los resultados se pueden reproducir con la configuración versionada del repositorio.</w:t>
-            </w:r>
-          </w:p>
-          <w:p>
-            <w:pPr>
-              <w:spacing w:after="80" w:lineRule="auto"/>
-              <w:rPr/>
-            </w:pPr>
-            <w:r>
-              <w:rPr>
-                <w:rtl w:val="0"/>
-              </w:rPr>
+              <w:br/>
               <w:t>Las metas de desempeño se fijarán con la línea base obtenida en el Sprint 3. Aprueban el Product Owner y el Sponsor, con revisión académica del docente.</w:t>
             </w:r>
           </w:p>
@@ -4677,19 +4164,8 @@
             </w:tcBorders>
           </w:tcPr>
           <w:p>
-            <w:pPr>
-              <w:spacing w:after="60" w:before="60" w:lineRule="auto"/>
-              <w:rPr/>
-            </w:pPr>
             <w:r>
-              <w:rPr>
-                <w:b w:val="0"/>
-                <w:bCs w:val="0"/>
-                <w:sz w:val="20"/>
-                <w:szCs w:val="20"/>
-                <w:rtl w:val="0"/>
-              </w:rPr>
-              <w:t>SIDERPERU (caso académico)</w:t>
+              <w:t>Empresa metalmecánica (caso propuesto)</w:t>
             </w:r>
           </w:p>
         </w:tc>
@@ -4703,19 +4179,8 @@
             </w:tcBorders>
           </w:tcPr>
           <w:p>
-            <w:pPr>
-              <w:spacing w:after="60" w:before="60" w:lineRule="auto"/>
-              <w:rPr/>
-            </w:pPr>
             <w:r>
-              <w:rPr>
-                <w:b w:val="0"/>
-                <w:bCs w:val="0"/>
-                <w:sz w:val="20"/>
-                <w:szCs w:val="20"/>
-                <w:rtl w:val="0"/>
-              </w:rPr>
-              <w:t>Gerente de operaciones</w:t>
+              <w:t>Gerente General</w:t>
             </w:r>
           </w:p>
         </w:tc>
@@ -4729,19 +4194,8 @@
             </w:tcBorders>
           </w:tcPr>
           <w:p>
-            <w:pPr>
-              <w:spacing w:after="60" w:before="60" w:lineRule="auto"/>
-              <w:rPr/>
-            </w:pPr>
             <w:r>
-              <w:rPr>
-                <w:b w:val="0"/>
-                <w:bCs w:val="0"/>
-                <w:sz w:val="20"/>
-                <w:szCs w:val="20"/>
-                <w:rtl w:val="0"/>
-              </w:rPr>
-              <w:t>12/10/2026</w:t>
+              <w:t>12/10/2026 (act. 17/10/2026)</w:t>
             </w:r>
           </w:p>
         </w:tc>

</xml_diff>